<commit_message>
Add Google Drive link to the cleaned dataset in the Phase 2 report
Co-Authored-By: Claude Opus 5.5 <noreply@anthropic.com>
</commit_message>
<xml_diff>
--- a/Phase2_Data_Preparation_Report.docx
+++ b/Phase2_Data_Preparation_Report.docx
@@ -8708,6 +8708,29 @@
       <w:r>
         <w:t xml:space="preserve">The cleaned data holds 1,972,054 comments: 1,777,414 for training, 97,320 for validation and 97,320 for testing. Cleaning did not change the class balance, which stays at 8.00% toxic in training and 7.88% and 7.99% in validation and test. The mean comment is 298 characters (median 203). Each split is stored as a Parquet file of 80 columns (501 MB for training) with its row-aligned Word2Vec matrix. Every fitted parameter (clip limits, means, standard deviations, publication categories and the word vectors) is saved next to them, so the same pipeline can be applied to a new comment.</w:t>
       </w:r>
+    </w:p>
+    <w:p>
+      <w:pPr>
+        <w:spacing w:after="60" w:before="60"/>
+      </w:pPr>
+      <w:r>
+        <w:rPr>
+          <w:b/>
+          <w:bCs/>
+        </w:rPr>
+        <w:t xml:space="preserve">Cleaned dataset: </w:t>
+      </w:r>
+      <w:hyperlink w:history="1" r:id="rId3cmwo_dp4bexfven4bfxq">
+        <w:r>
+          <w:rPr>
+            <w:color w:val="1F4E9A"/>
+            <w:sz w:val="16"/>
+            <w:szCs w:val="16"/>
+            <w:u w:val="single"/>
+          </w:rPr>
+          <w:t xml:space="preserve">https://drive.google.com/drive/folders/1zVfZamzpx0P-tyvNQ8fbEE2nyBqw1Dcy?usp=sharing</w:t>
+        </w:r>
+      </w:hyperlink>
     </w:p>
     <w:p>
       <w:pPr>

</xml_diff>

<commit_message>
Align Phase 2 analysis with course material; add full feature-to-feature correlation
Nominal columns are now measured with information gain (the ID3 criterion)
instead of Cramer's V, point-biserial r is called Pearson r with the 0/1
label, and the skip-gram choice uses the course's semantic-vs-syntactic
reasoning. The correlation check now covers all 133 final features
(tabular plus Word2Vec), with a new figure. The cleaned data is unchanged.

Co-Authored-By: Claude Opus 5.5 <noreply@anthropic.com>
</commit_message>
<xml_diff>
--- a/Phase2_Data_Preparation_Report.docx
+++ b/Phase2_Data_Preparation_Report.docx
@@ -393,7 +393,7 @@
         <w:jc w:val="both"/>
       </w:pPr>
       <w:r>
-        <w:t xml:space="preserve">Table 1 lists all 45 columns with their type, missing values, number of distinct values and what this phase does with them. All relations to the label in this section are measured on the 1,804,874 training comments, and the label is either the toxicity score or its binary form y = (toxicity ≥ 0.5). For a numeric column we report the Pearson and Spearman correlations with the score, the point-biserial correlation with y (Pearson's r with a 0/1 variable), and the column's mean in each class. For a nominal column we report Cramér's V from the chi-square table against y, and the toxic rate in each category.</w:t>
+        <w:t xml:space="preserve">Table 1 lists all 45 columns with their type, missing values, number of distinct values and what this phase does with them. All relations to the label in this section are measured on the 1,804,874 training comments, and the label is either the toxicity score or its binary form y = (toxicity ≥ 0.5). For a numeric column we report the Pearson and Spearman correlations with the score, Pearson's r with the 0/1 label y, and the column's mean in each class. For a nominal column we report the toxic rate in each category and the information gain IG = H(y) − H(y | column), the entropy-based measure that ID3 uses to choose decision-tree splits. The label's entropy is H(y) = 0.402 bits, so IG says how much of that uncertainty a column removes.</w:t>
       </w:r>
     </w:p>
     <w:p>
@@ -1759,7 +1759,7 @@
                 <w:sz w:val="15"/>
                 <w:szCs w:val="15"/>
               </w:rPr>
-              <w:t xml:space="preserve">not a feature (leaks the label); kept as a sample weight</w:t>
+              <w:t xml:space="preserve">not a feature (leaks the label); kept for reference</w:t>
             </w:r>
           </w:p>
         </w:tc>
@@ -3091,7 +3091,7 @@
         <w:jc w:val="both"/>
       </w:pPr>
       <w:r>
-        <w:t xml:space="preserve">The dataset documentation notes that some comments were shown to far more raters than the usual panel [3]. Whatever the rule, the count is decided by the annotation process after the comment exists, and it depends on how toxic the comment looked. A new comment arriving at the moderation aid has no annotator count. A model trained with it would learn that "many annotators means toxic" and would have nothing to apply that rule to in use, which is leakage. It is therefore not a feature. It is still useful: a score from ten raters is more reliable than one from four, so the cleaned data keeps it as </w:t>
+        <w:t xml:space="preserve">The dataset documentation notes that some comments were shown to far more raters than the usual panel [3]. Whatever the rule, the count is decided by the annotation process after the comment exists, and it depends on how toxic the comment looked. A new comment arriving at the moderation aid has no annotator count. A model trained with it would learn that "many annotators means toxic" and would have nothing to apply that rule to in use, which is leakage. It is therefore not a feature. The cleaned data keeps it as </w:t>
       </w:r>
       <w:r>
         <w:rPr>
@@ -3102,7 +3102,7 @@
         <w:t xml:space="preserve">n_annotators</w:t>
       </w:r>
       <w:r>
-        <w:t xml:space="preserve"> for weighting training examples. identity_annotator_count is 0 for 77.55% of training comments and is non-zero exactly when the identity columns are present (checked on every row), so it adds nothing beyond a flag and is dropped.</w:t>
+        <w:t xml:space="preserve"> for reference only. identity_annotator_count is 0 for 77.55% of training comments and is non-zero exactly when the identity columns are present (checked on every row), so it adds nothing beyond a flag and is dropped.</w:t>
       </w:r>
     </w:p>
     <w:p>
@@ -3281,7 +3281,7 @@
         <w:jc w:val="both"/>
       </w:pPr>
       <w:r>
-        <w:t xml:space="preserve">To see how much can be read from the style of a comment without its words, we counted 15 statistics per comment: length in characters, letters and words, mean word length, upper-case letters and their ratio to all letters, fully capitalised words of three or more letters ("shouting"), exclamation and question marks, runs of repeated "!" or "?", words masked with asterisks, links, digits, line breaks and non-ASCII characters. Figure 5 gives their point-biserial correlation with y. Every one is weak. The strongest are masked words (+0.050), digits (−0.044) and exclamation marks (+0.042); digits and links lean non-toxic, because comments that cite figures and sources tend to be arguments rather than attacks. The conclusion is that toxicity lives in the words, not the typography, which is why the text is encoded word by word with Word2Vec (Section 4.7). Its dimensions correlate with the labels several times more strongly than any style statistic (Section 5.2).</w:t>
+        <w:t xml:space="preserve">To see how much can be read from the style of a comment without its words, we counted 15 statistics per comment: length in characters, letters and words, mean word length, upper-case letters and their ratio to all letters, fully capitalised words of three or more letters ("shouting"), exclamation and question marks, runs of repeated "!" or "?", words masked with asterisks, links, digits, line breaks and non-ASCII characters. Figure 5 gives their Pearson correlation with the 0/1 label y. Every one is weak. The strongest are masked words (+0.050), digits (−0.044) and exclamation marks (+0.042); digits and links lean non-toxic, because comments that cite figures and sources tend to be arguments rather than attacks. The conclusion is that toxicity lives in the words, not the typography, which is why the text is encoded word by word with Word2Vec (Section 4.7). Its dimensions correlate with the labels several times more strongly than any style statistic (Section 5.2).</w:t>
       </w:r>
     </w:p>
     <w:p>
@@ -3349,7 +3349,7 @@
           <w:sz w:val="16"/>
           <w:szCs w:val="16"/>
         </w:rPr>
-        <w:t xml:space="preserve"> Point-biserial correlation of each candidate text statistic with the toxic label (training split). Blue: kept; grey: dropped (Section 4.6). The largest |r| is 0.050.</w:t>
+        <w:t xml:space="preserve"> Pearson correlation of each candidate text statistic with the toxic label (training split). Blue: kept; grey: dropped (Section 4.6). The largest |r| is 0.050.</w:t>
       </w:r>
     </w:p>
     <w:p>
@@ -3404,7 +3404,7 @@
         <w:t xml:space="preserve">rating</w:t>
       </w:r>
       <w:r>
-        <w:t xml:space="preserve"> records the platform's moderation outcome: 1,684,758 training comments were approved and 120,116 rejected. Rejected comments are toxic 26.0% of the time against 6.7% for approved ones (Cramér's V 0.177). The verdict was given by people judging the same comment after it was written, so it is a second label rather than an input, and it is not a feature.</w:t>
+        <w:t xml:space="preserve"> records the platform's moderation outcome: 1,684,758 training comments were approved and 120,116 rejected. Rejected comments are toxic 26.0% of the time against 6.7% for approved ones (information gain 0.0155 bits, 3.86% of H(y), the largest of any metadata column). The verdict was given by people judging the same comment after it was written, so it is a second label rather than an input, and it is not a feature.</w:t>
       </w:r>
     </w:p>
     <w:p>
@@ -3421,7 +3421,7 @@
         <w:t xml:space="preserve">publication_id</w:t>
       </w:r>
       <w:r>
-        <w:t xml:space="preserve"> has 53 values. The ten largest publications hold 97.9% of training comments, while 34 publications have fewer than 1,000 comments each (6,562 comments in total). Every publication in validation and test also appears in training. Figure 6 shows that the toxic rate differs from site to site, from 1.46% to 16.31% among publications with at least 1,000 comments (Cramér's V 0.067). The publication is known when a comment is posted, so it is kept as a feature.</w:t>
+        <w:t xml:space="preserve"> has 53 values. The ten largest publications hold 97.9% of training comments, while 34 publications have fewer than 1,000 comments each (6,562 comments in total). Every publication in validation and test also appears in training. Figure 6 shows that the toxic rate differs from site to site, from 1.46% to 16.31% among publications with at least 1,000 comments (information gain 0.0031 bits, 0.78% of H(y)). The publication is known when a comment is posted, so it is kept as a feature.</w:t>
       </w:r>
     </w:p>
     <w:p>
@@ -3505,7 +3505,7 @@
         <w:t xml:space="preserve">created_date</w:t>
       </w:r>
       <w:r>
-        <w:t xml:space="preserve"> spans 2015-09-29 to 2017-11-11, and all three splits cover the same range, so the split is not by time. Only 651 training comments are from 2015. The date carries almost nothing about the label: Cramér's V with y is 0.002 for the year, 0.021 for the month, 0.017 for the hour and 0.009 for the day of the week, and the toxic rate is 7.94% in 2016 and 8.02% in 2017.</w:t>
+        <w:t xml:space="preserve"> spans 2015-09-29 to 2017-11-11, and all three splits cover the same range, so the split is not by time. Only 651 training comments are from 2015. The date carries almost nothing about the label. Split into year, month, hour and day of the week, no part removes more than 0.08% of the label's entropy (information gain 0.000004, 0.0003, 0.0002 and 0.0001 bits), and the toxic rate is 7.94% in 2016 and 8.02% in 2017. The year would also never generalise: a model in use after 2017 would only see years it was not trained on.</w:t>
       </w:r>
     </w:p>
     <w:p>
@@ -3522,7 +3522,7 @@
         <w:t xml:space="preserve">parent_id</w:t>
       </w:r>
       <w:r>
-        <w:t xml:space="preserve"> is missing for 43.14% of training comments, but these values are not lost: a top-level comment has no parent. The useful information is whether the comment is a reply. Top-level comments are toxic 8.62% of the time and replies 7.52% (V = 0.020). The parent comment itself is in the dataset for 98.0% of replies, which a later phase could use as context.</w:t>
+        <w:t xml:space="preserve"> is missing for 43.14% of training comments, but these values are not lost: a top-level comment has no parent. The useful information is whether the comment is a reply. Top-level comments are toxic 8.62% of the time and replies 7.52% (information gain 0.0003 bits, 0.07% of H(y)). The parent comment itself is in the dataset for 98.0% of replies, which a later phase could use as context.</w:t>
       </w:r>
     </w:p>
     <w:p>
@@ -3573,7 +3573,7 @@
         <w:jc w:val="both"/>
       </w:pPr>
       <w:r>
-        <w:t xml:space="preserve">Table 2 puts the candidate inputs side by side. The two strongest columns, the annotator count and the moderation verdict, are both produced after a comment is written and would leak the label; the annotator count is also above the 0.85 correlation limit. Of the columns available at posting time, the publication and the reply flag carry a little signal, the date carries none, and the style statistics carry little. Almost all of the usable information is in the words, which Section 4.7 encodes.</w:t>
+        <w:t xml:space="preserve">Table 2 puts the candidate inputs side by side. The two strongest columns, the annotator count and the moderation verdict, are both produced after a comment is written and would leak the label; the annotator count is also above the 0.85 correlation limit. Of the columns available at posting time, the publication carries a little signal and the style statistics carry little. The reply flag and the date are both very weak (under 0.1% of H(y) each). We keep the reply flag because it is a structural fact about the comment that costs one binary column, and drop the date because none of its parts is stronger and the year cannot generalise. Almost all of the usable information is in the words, which Section 4.7 encodes.</w:t>
       </w:r>
     </w:p>
     <w:p>
@@ -3595,7 +3595,7 @@
           <w:sz w:val="16"/>
           <w:szCs w:val="16"/>
         </w:rPr>
-        <w:t xml:space="preserve"> Relation of each candidate input to the toxic label (training split) and whether it exists when a comment is posted.</w:t>
+        <w:t xml:space="preserve"> Relation of each candidate input to the toxic label (training split) and whether it exists when a comment is posted. IG is information gain in bits, out of H(y) = 0.402.</w:t>
       </w:r>
     </w:p>
     <w:tbl>
@@ -3939,7 +3939,7 @@
                 <w:sz w:val="15"/>
                 <w:szCs w:val="15"/>
               </w:rPr>
-              <w:t xml:space="preserve">V 0.177</w:t>
+              <w:t xml:space="preserve">IG 0.0155</w:t>
             </w:r>
           </w:p>
         </w:tc>
@@ -4189,7 +4189,7 @@
                 <w:sz w:val="15"/>
                 <w:szCs w:val="15"/>
               </w:rPr>
-              <w:t xml:space="preserve">V 0.067</w:t>
+              <w:t xml:space="preserve">IG 0.0031</w:t>
             </w:r>
           </w:p>
         </w:tc>
@@ -4564,7 +4564,7 @@
                 <w:sz w:val="15"/>
                 <w:szCs w:val="15"/>
               </w:rPr>
-              <w:t xml:space="preserve">V 0.020</w:t>
+              <w:t xml:space="preserve">IG 0.0003</w:t>
             </w:r>
           </w:p>
         </w:tc>
@@ -4689,7 +4689,7 @@
                 <w:sz w:val="15"/>
                 <w:szCs w:val="15"/>
               </w:rPr>
-              <w:t xml:space="preserve">V ≤ 0.021</w:t>
+              <w:t xml:space="preserve">IG ≤ 0.0003</w:t>
             </w:r>
           </w:p>
         </w:tc>
@@ -4814,7 +4814,7 @@
                 <w:sz w:val="15"/>
                 <w:szCs w:val="15"/>
               </w:rPr>
-              <w:t xml:space="preserve">|r_pb| ≤ 0.050</w:t>
+              <w:t xml:space="preserve">|r| ≤ 0.050</w:t>
             </w:r>
           </w:p>
         </w:tc>
@@ -5942,7 +5942,7 @@
         <w:t xml:space="preserve">Text statistics.</w:t>
       </w:r>
       <w:r>
-        <w:t xml:space="preserve"> Of the 15 candidates, a statistic is dropped if it adds nothing new (|r| &gt; 0.9 with a statistic already kept) or if it has no relation to the label (|ρ| &lt; 0.01 and |r_pb| &lt; 0.01). n non ascii is unrelated to the label (rho -0.002, r_pb -0.005); n chars is redundant with n_words (r = 0.992); n letters is redundant with n_words (r = 0.990). That leaves 12. Figure 7 shows why they need transforming: the counts are piled up at zero with long right tails (skew 39.3 for exclamation marks and 1.23 for words). Each count is replaced by log(1 + x), which pulls the tail in (skew 3.37 and -0.30 afterwards). The two ratios, mean word length and the upper-case ratio, are capped at their 1st and 99th training percentiles instead, since comments made only of a link have mean word lengths above 40. Every statistic is then standardised to z = (x − mean) / std with the training mean and standard deviation.</w:t>
+        <w:t xml:space="preserve"> Of the 15 candidates, a statistic is dropped if it adds nothing new (|r| &gt; 0.9 with a statistic already kept) or if it has no relation to the label (|ρ| &lt; 0.01 and |r| &lt; 0.01 with y). n non ascii is unrelated to the label (rho -0.002, r -0.005); n chars is redundant with n_words (r = 0.992); n letters is redundant with n_words (r = 0.990). That leaves 12. Figure 7 shows why they need transforming: the counts are piled up at zero with long right tails (skew 39.3 for exclamation marks and 1.23 for words). Each count is replaced by log(1 + x), which pulls the tail in (skew 3.37 and -0.30 afterwards). The two ratios, mean word length and the upper-case ratio, are capped at their 1st and 99th training percentiles instead, since comments made only of a link have mean word lengths above 40. Every statistic is then standardised to z = (x − mean) / std with the training mean and standard deviation.</w:t>
       </w:r>
     </w:p>
     <w:p>
@@ -6081,7 +6081,7 @@
         <w:jc w:val="both"/>
       </w:pPr>
       <w:r>
-        <w:t xml:space="preserve">The comment text has to be either one-hot encoded or embedded. A one-hot encoding would need a column for every word in a vocabulary of tens of thousands, almost all zero for any one comment, and would treat "idiot" and "moron" as unrelated columns. We therefore embed the text with Word2Vec, which places words used in similar contexts close together. We trained a skip-gram model [5, 6] on the training comments only, with 100 dimensions, a window of 5 words, words seen at least 5 times, 5 negative samples and 5 epochs. We chose skip-gram over CBOW because it learns better vectors for rare words, and most insults are rare. The model learned 82,724 words from 93,291,771 training tokens, and 99.7% of validation tokens are in its vocabulary. A quick check confirms that it learned meaning: the nearest neighbours of "idiot" are "imbecile", "moron", "asshat", "ignoramus", and those of "thanks" are "thank", "thx", "mahalo", "thanx". A comment's embedding is the mean of its words' vectors (the zero vector for the 828 training comments with no known word). Each of the 100 dimensions is then standardised with the training mean and standard deviation, like the other numeric features.</w:t>
+        <w:t xml:space="preserve">The comment text has to be either one-hot encoded or embedded. A one-hot encoding would need a column for every word in a vocabulary of tens of thousands, almost all zero for any one comment, and would treat "idiot" and "moron" as unrelated columns. We therefore embed the text with Word2Vec, which places words used in similar contexts close together. We trained a skip-gram model [5, 6] on the training comments only, with 100 dimensions, a window of 5 words, words seen at least 5 times, 5 negative samples and 5 epochs. We chose skip-gram over CBOW because skip-gram learns semantic relationships between words, while CBOW mostly learns syntactic, positional similarity, and toxicity is a matter of meaning: "idiot" and "moron" should be close because they mean the same thing. Skip-gram is slower to train and needs more data, which a training corpus of this size provides. The model learned 82,724 words from 93,291,771 training tokens, and 99.7% of validation tokens are in its vocabulary. A quick check confirms that it learned meaning: the nearest neighbours of "idiot" are "imbecile", "moron", "asshat", "ignoramus", and those of "thanks" are "thank", "thx", "mahalo", "thanx". A comment's embedding is the mean of its words' vectors (the zero vector for the 828 training comments with no known word). Each of the 100 dimensions is then standardised with the training mean and standard deviation, like the other numeric features.</w:t>
       </w:r>
     </w:p>
     <w:p>
@@ -7013,7 +7013,7 @@
                 <w:sz w:val="15"/>
                 <w:szCs w:val="15"/>
               </w:rPr>
-              <w:t xml:space="preserve">n_annotators (sample weight), 24 identity scores + identity_annotated (bias audit), text, text_bow, publication_id, created_date, rating</w:t>
+              <w:t xml:space="preserve">n_annotators, 24 identity scores + identity_annotated (bias audit), text, text_bow, publication_id, created_date, rating</w:t>
             </w:r>
           </w:p>
         </w:tc>
@@ -7202,7 +7202,7 @@
           <w:i/>
           <w:iCs/>
         </w:rPr>
-        <w:t xml:space="preserve">5.1  Cross-correlation of the features</w:t>
+        <w:t xml:space="preserve">5.1  Feature-to-feature correlation</w:t>
       </w:r>
     </w:p>
     <w:p>
@@ -7284,37 +7284,11 @@
     </w:p>
     <w:p>
       <w:pPr>
-        <w:keepNext/>
-        <w:spacing w:after="45" w:before="120"/>
-      </w:pPr>
-      <w:r>
-        <w:rPr>
-          <w:b/>
-          <w:bCs/>
-          <w:i/>
-          <w:iCs/>
-        </w:rPr>
-        <w:t xml:space="preserve">5.2  Correlation with the labels and the leakage check</w:t>
-      </w:r>
-    </w:p>
-    <w:p>
-      <w:pPr>
         <w:spacing w:line="211"/>
         <w:jc w:val="both"/>
       </w:pPr>
       <w:r>
-        <w:t xml:space="preserve">A feature that correlates with a target at |r| ≥ 0.85 would be standing in for the label rather than helping to predict it, so any such feature has to be dropped. </w:t>
-      </w:r>
-      <w:r>
-        <w:rPr>
-          <w:rFonts w:ascii="Consolas" w:cs="Consolas" w:eastAsia="Consolas" w:hAnsi="Consolas"/>
-          <w:sz w:val="18"/>
-          <w:szCs w:val="18"/>
-        </w:rPr>
-        <w:t xml:space="preserve">05_correlation_checks</w:t>
-      </w:r>
-      <w:r>
-        <w:t xml:space="preserve"> computes Pearson's r between every final feature and each of the six targets on the training split, and stops with an error if any value reaches 0.85. Figure 9 shows the values for the tabular features. The largest absolute correlations are 0.100 for the tabular features (n masked with obscene), and 0.149 for the 100 Word2Vec dimensions (dimension 57 with toxicity). All are far below 0.85, so no feature is removed by this rule. The only pair in the data that does exceed it is two labels, insult and toxicity (r = 0.93), and labels are never inputs. Before cleaning, the one input column above the limit was toxicity_annotator_count (ρ = 0.91), which Section 3.2 removed.</w:t>
+        <w:t xml:space="preserve">Figure 9 extends the check to all 133 final features by adding the 100 Word2Vec dimensions. Of the 8,778 pairs of features, none exceeds 0.9 and only 3 exceed 0.5, all of them pairs of text statistics already shown above. The strongest pair of Word2Vec dimensions has r = -0.44 (dimensions 22 and 64), and the strongest relation between a Word2Vec dimension and a tabular feature is r = -0.31 (dimension 40 with n words). No feature is a copy of another, and the embedding carries information that the tabular features do not, so no feature is removed for redundancy.</w:t>
       </w:r>
     </w:p>
     <w:p>
@@ -7326,7 +7300,7 @@
       <w:r>
         <w:drawing>
           <wp:inline distT="0" distB="0" distL="0" distR="0">
-            <wp:extent cx="2971800" cy="2532052"/>
+            <wp:extent cx="2971800" cy="2115748"/>
             <wp:effectExtent t="0" r="0" b="0" l="0"/>
             <wp:docPr id="9" name="" descr="" title=""/>
             <wp:cNvGraphicFramePr>
@@ -7351,6 +7325,109 @@
                   <pic:spPr bwMode="auto">
                     <a:xfrm>
                       <a:off x="0" y="0"/>
+                      <a:ext cx="2971800" cy="2115748"/>
+                    </a:xfrm>
+                    <a:prstGeom prst="rect">
+                      <a:avLst/>
+                    </a:prstGeom>
+                  </pic:spPr>
+                </pic:pic>
+              </a:graphicData>
+            </a:graphic>
+          </wp:inline>
+        </w:drawing>
+      </w:r>
+    </w:p>
+    <w:p>
+      <w:pPr>
+        <w:spacing w:after="120" w:before="55"/>
+      </w:pPr>
+      <w:r>
+        <w:rPr>
+          <w:b/>
+          <w:bCs/>
+          <w:sz w:val="16"/>
+          <w:szCs w:val="16"/>
+        </w:rPr>
+        <w:t xml:space="preserve">Figure 9:</w:t>
+      </w:r>
+      <w:r>
+        <w:rPr>
+          <w:sz w:val="16"/>
+          <w:szCs w:val="16"/>
+        </w:rPr>
+        <w:t xml:space="preserve"> Pearson correlation between all 133 final features (training split): 12 text statistics, the reply flag, 20 publication columns and 100 Word2Vec dimensions. Blue is positive, orange negative; the diagonal is each feature with itself.</w:t>
+      </w:r>
+    </w:p>
+    <w:p>
+      <w:pPr>
+        <w:keepNext/>
+        <w:spacing w:after="45" w:before="120"/>
+      </w:pPr>
+      <w:r>
+        <w:rPr>
+          <w:b/>
+          <w:bCs/>
+          <w:i/>
+          <w:iCs/>
+        </w:rPr>
+        <w:t xml:space="preserve">5.2  Correlation with the labels and the leakage check</w:t>
+      </w:r>
+    </w:p>
+    <w:p>
+      <w:pPr>
+        <w:spacing w:line="211"/>
+        <w:jc w:val="both"/>
+      </w:pPr>
+      <w:r>
+        <w:t xml:space="preserve">A feature that correlates with a target at |r| ≥ 0.85 would be standing in for the label rather than helping to predict it, so any such feature has to be dropped. </w:t>
+      </w:r>
+      <w:r>
+        <w:rPr>
+          <w:rFonts w:ascii="Consolas" w:cs="Consolas" w:eastAsia="Consolas" w:hAnsi="Consolas"/>
+          <w:sz w:val="18"/>
+          <w:szCs w:val="18"/>
+        </w:rPr>
+        <w:t xml:space="preserve">05_correlation_checks</w:t>
+      </w:r>
+      <w:r>
+        <w:t xml:space="preserve"> computes Pearson's r between every final feature and each of the six targets on the training split, and stops with an error if any value reaches 0.85. Figure 10 shows the values for the tabular features. The largest absolute correlations are 0.100 for the tabular features (n masked with obscene), and 0.149 for the 100 Word2Vec dimensions (dimension 57 with toxicity). All are far below 0.85, so no feature is removed by this rule. The only pair in the data that does exceed it is two labels, insult and toxicity (r = 0.93), and labels are never inputs. Before cleaning, the one input column above the limit was toxicity_annotator_count (ρ = 0.91), which Section 3.2 removed.</w:t>
+      </w:r>
+    </w:p>
+    <w:p>
+      <w:pPr>
+        <w:keepNext/>
+        <w:spacing w:before="120"/>
+        <w:jc w:val="center"/>
+      </w:pPr>
+      <w:r>
+        <w:drawing>
+          <wp:inline distT="0" distB="0" distL="0" distR="0">
+            <wp:extent cx="2971800" cy="2532052"/>
+            <wp:effectExtent t="0" r="0" b="0" l="0"/>
+            <wp:docPr id="10" name="" descr="" title=""/>
+            <wp:cNvGraphicFramePr>
+              <a:graphicFrameLocks xmlns:a="http://schemas.openxmlformats.org/drawingml/2006/main" noChangeAspect="1"/>
+            </wp:cNvGraphicFramePr>
+            <a:graphic xmlns:a="http://schemas.openxmlformats.org/drawingml/2006/main">
+              <a:graphicData uri="http://schemas.openxmlformats.org/drawingml/2006/picture">
+                <pic:pic xmlns:pic="http://schemas.openxmlformats.org/drawingml/2006/picture">
+                  <pic:nvPicPr>
+                    <pic:cNvPr id="0" name="" descr=""/>
+                    <pic:cNvPicPr>
+                      <a:picLocks noChangeAspect="1" noChangeArrowheads="1"/>
+                    </pic:cNvPicPr>
+                  </pic:nvPicPr>
+                  <pic:blipFill>
+                    <a:blip r:embed="rId16" cstate="none"/>
+                    <a:srcRect/>
+                    <a:stretch>
+                      <a:fillRect/>
+                    </a:stretch>
+                  </pic:blipFill>
+                  <pic:spPr bwMode="auto">
+                    <a:xfrm>
+                      <a:off x="0" y="0"/>
                       <a:ext cx="2971800" cy="2532052"/>
                     </a:xfrm>
                     <a:prstGeom prst="rect">
@@ -7375,7 +7452,7 @@
           <w:sz w:val="16"/>
           <w:szCs w:val="16"/>
         </w:rPr>
-        <w:t xml:space="preserve">Figure 9:</w:t>
+        <w:t xml:space="preserve">Figure 10:</w:t>
       </w:r>
       <w:r>
         <w:rPr>
@@ -8720,7 +8797,7 @@
         </w:rPr>
         <w:t xml:space="preserve">Cleaned dataset: </w:t>
       </w:r>
-      <w:hyperlink w:history="1" r:id="rId3cmwo_dp4bexfven4bfxq">
+      <w:hyperlink w:history="1" r:id="rIdytd5ljkqs2ggw4zunbgv8">
         <w:r>
           <w:rPr>
             <w:color w:val="1F4E9A"/>

</xml_diff>